<commit_message>
Updated project report file
</commit_message>
<xml_diff>
--- a/Virtual_Research_Assistant_Project_Report.docx
+++ b/Virtual_Research_Assistant_Project_Report.docx
@@ -4,18 +4,7 @@
   <w:body>
     <w:p>
       <w:pPr>
-        <w:jc w:val="center"/>
-      </w:pPr>
-      <w:r>
-        <w:rPr>
-          <w:b/>
-          <w:sz w:val="48"/>
-        </w:rPr>
-        <w:t>PROJECT REPORT</w:t>
-      </w:r>
-    </w:p>
-    <w:p>
-      <w:pPr>
+        <w:spacing w:before="0" w:after="80" w:line="240" w:lineRule="auto"/>
         <w:jc w:val="center"/>
       </w:pPr>
       <w:r>
@@ -23,11 +12,25 @@
           <w:b/>
           <w:sz w:val="40"/>
         </w:rPr>
+        <w:t>PROJECT REPORT</w:t>
+      </w:r>
+    </w:p>
+    <w:p>
+      <w:pPr>
+        <w:spacing w:before="0" w:after="80" w:line="240" w:lineRule="auto"/>
+        <w:jc w:val="center"/>
+      </w:pPr>
+      <w:r>
+        <w:rPr>
+          <w:b/>
+          <w:sz w:val="34"/>
+        </w:rPr>
         <w:t>Virtual Research Assistant</w:t>
       </w:r>
     </w:p>
     <w:p>
       <w:pPr>
+        <w:spacing w:before="0" w:after="80" w:line="240" w:lineRule="auto"/>
         <w:jc w:val="center"/>
       </w:pPr>
       <w:r>
@@ -37,9 +40,14 @@
         <w:t>AI-Powered Research Paper Retrieval, Summarization and Analysis</w:t>
       </w:r>
     </w:p>
-    <w:p/>
     <w:p>
       <w:pPr>
+        <w:spacing w:before="0" w:after="80" w:line="240" w:lineRule="auto"/>
+      </w:pPr>
+    </w:p>
+    <w:p>
+      <w:pPr>
+        <w:spacing w:before="0" w:after="80" w:line="240" w:lineRule="auto"/>
         <w:jc w:val="center"/>
       </w:pPr>
       <w:r>
@@ -50,24 +58,26 @@
       </w:r>
     </w:p>
     <w:p>
-      <w:r>
-        <w:br w:type="page"/>
-      </w:r>
-    </w:p>
-    <w:p>
       <w:pPr>
         <w:pStyle w:val="Heading1"/>
+        <w:spacing w:before="0" w:after="80" w:line="240" w:lineRule="auto"/>
       </w:pPr>
       <w:r>
         <w:t>1. Executive Summary</w:t>
       </w:r>
     </w:p>
     <w:p>
+      <w:pPr>
+        <w:spacing w:before="0" w:after="80" w:line="240" w:lineRule="auto"/>
+      </w:pPr>
       <w:r>
         <w:t>The Virtual Research Assistant is an AI-powered web application designed to simplify the early stages of academic research. A user enters a research topic through a Streamlit interface, the application retrieves relevant research papers from ArXiv, and AI agents automatically generate a concise summary followed by an advantages-and-disadvantages analysis. The final results are presented in an interactive web interface with paper titles, links, summaries, and analysis.</w:t>
       </w:r>
     </w:p>
     <w:p>
+      <w:pPr>
+        <w:spacing w:before="0" w:after="80" w:line="240" w:lineRule="auto"/>
+      </w:pPr>
       <w:r>
         <w:t>The deployed version of the project uses ArXiv as the active paper source. Google Scholar integration exists in the data-loader module but was removed from the active application flow because automated Google Scholar requests can be unreliable from cloud hosting environments. This report therefore documents the currently deployed ArXiv-based workflow.</w:t>
       </w:r>
@@ -1341,7 +1351,7 @@
     </w:p>
     <w:sectPr>
       <w:pgSz w:w="12240" w:h="15840"/>
-      <w:pgMar w:top="1008" w:right="1152" w:bottom="1008" w:left="1152" w:header="720" w:footer="720" w:gutter="0"/>
+      <w:pgMar w:top="792" w:right="1152" w:bottom="792" w:left="1152" w:header="720" w:footer="720" w:gutter="0"/>
       <w:cols w:space="720"/>
       <w:docGrid w:linePitch="360"/>
     </w:sectPr>

</xml_diff>